<commit_message>
Realizacion memoria parte 2 y mejora de los grafos parte 2
</commit_message>
<xml_diff>
--- a/Trabajo1/Trabajo busqueda SI.docx
+++ b/Trabajo1/Trabajo busqueda SI.docx
@@ -442,439 +442,6 @@
       </w:pPr>
       <w:r>
         <w:rPr/>
-        <w:t>Indice</w:t>
-      </w:r>
-    </w:p>
-    <w:p>
-      <w:pPr>
-        <w:pStyle w:val="normal1"/>
-        <w:rPr/>
-      </w:pPr>
-      <w:r>
-        <w:rPr/>
-      </w:r>
-    </w:p>
-    <w:p>
-      <w:pPr>
-        <w:pStyle w:val="normal1"/>
-        <w:rPr/>
-      </w:pPr>
-      <w:r>
-        <w:rPr/>
-      </w:r>
-    </w:p>
-    <w:p>
-      <w:pPr>
-        <w:pStyle w:val="normal1"/>
-        <w:rPr/>
-      </w:pPr>
-      <w:r>
-        <w:rPr/>
-      </w:r>
-    </w:p>
-    <w:p>
-      <w:pPr>
-        <w:pStyle w:val="normal1"/>
-        <w:rPr/>
-      </w:pPr>
-      <w:r>
-        <w:rPr/>
-      </w:r>
-    </w:p>
-    <w:p>
-      <w:pPr>
-        <w:pStyle w:val="normal1"/>
-        <w:rPr/>
-      </w:pPr>
-      <w:r>
-        <w:rPr/>
-      </w:r>
-    </w:p>
-    <w:p>
-      <w:pPr>
-        <w:pStyle w:val="normal1"/>
-        <w:rPr/>
-      </w:pPr>
-      <w:r>
-        <w:rPr/>
-      </w:r>
-    </w:p>
-    <w:p>
-      <w:pPr>
-        <w:pStyle w:val="normal1"/>
-        <w:rPr/>
-      </w:pPr>
-      <w:r>
-        <w:rPr/>
-      </w:r>
-    </w:p>
-    <w:p>
-      <w:pPr>
-        <w:pStyle w:val="normal1"/>
-        <w:rPr/>
-      </w:pPr>
-      <w:r>
-        <w:rPr/>
-      </w:r>
-    </w:p>
-    <w:p>
-      <w:pPr>
-        <w:pStyle w:val="normal1"/>
-        <w:rPr/>
-      </w:pPr>
-      <w:r>
-        <w:rPr/>
-      </w:r>
-    </w:p>
-    <w:p>
-      <w:pPr>
-        <w:pStyle w:val="normal1"/>
-        <w:rPr/>
-      </w:pPr>
-      <w:r>
-        <w:rPr/>
-      </w:r>
-    </w:p>
-    <w:p>
-      <w:pPr>
-        <w:pStyle w:val="normal1"/>
-        <w:rPr/>
-      </w:pPr>
-      <w:r>
-        <w:rPr/>
-      </w:r>
-    </w:p>
-    <w:p>
-      <w:pPr>
-        <w:pStyle w:val="normal1"/>
-        <w:rPr/>
-      </w:pPr>
-      <w:r>
-        <w:rPr/>
-      </w:r>
-    </w:p>
-    <w:p>
-      <w:pPr>
-        <w:pStyle w:val="normal1"/>
-        <w:rPr/>
-      </w:pPr>
-      <w:r>
-        <w:rPr/>
-      </w:r>
-    </w:p>
-    <w:p>
-      <w:pPr>
-        <w:pStyle w:val="normal1"/>
-        <w:rPr/>
-      </w:pPr>
-      <w:r>
-        <w:rPr/>
-      </w:r>
-    </w:p>
-    <w:p>
-      <w:pPr>
-        <w:pStyle w:val="normal1"/>
-        <w:rPr/>
-      </w:pPr>
-      <w:r>
-        <w:rPr/>
-      </w:r>
-    </w:p>
-    <w:p>
-      <w:pPr>
-        <w:pStyle w:val="normal1"/>
-        <w:rPr/>
-      </w:pPr>
-      <w:r>
-        <w:rPr/>
-      </w:r>
-    </w:p>
-    <w:p>
-      <w:pPr>
-        <w:pStyle w:val="normal1"/>
-        <w:rPr/>
-      </w:pPr>
-      <w:r>
-        <w:rPr/>
-      </w:r>
-    </w:p>
-    <w:p>
-      <w:pPr>
-        <w:pStyle w:val="normal1"/>
-        <w:rPr/>
-      </w:pPr>
-      <w:r>
-        <w:rPr/>
-      </w:r>
-    </w:p>
-    <w:p>
-      <w:pPr>
-        <w:pStyle w:val="normal1"/>
-        <w:rPr/>
-      </w:pPr>
-      <w:r>
-        <w:rPr/>
-      </w:r>
-    </w:p>
-    <w:p>
-      <w:pPr>
-        <w:pStyle w:val="normal1"/>
-        <w:rPr/>
-      </w:pPr>
-      <w:r>
-        <w:rPr/>
-      </w:r>
-    </w:p>
-    <w:p>
-      <w:pPr>
-        <w:pStyle w:val="normal1"/>
-        <w:rPr/>
-      </w:pPr>
-      <w:r>
-        <w:rPr/>
-      </w:r>
-    </w:p>
-    <w:p>
-      <w:pPr>
-        <w:pStyle w:val="normal1"/>
-        <w:rPr/>
-      </w:pPr>
-      <w:r>
-        <w:rPr/>
-      </w:r>
-    </w:p>
-    <w:p>
-      <w:pPr>
-        <w:pStyle w:val="normal1"/>
-        <w:rPr/>
-      </w:pPr>
-      <w:r>
-        <w:rPr/>
-      </w:r>
-    </w:p>
-    <w:p>
-      <w:pPr>
-        <w:pStyle w:val="normal1"/>
-        <w:rPr/>
-      </w:pPr>
-      <w:r>
-        <w:rPr/>
-      </w:r>
-    </w:p>
-    <w:p>
-      <w:pPr>
-        <w:pStyle w:val="normal1"/>
-        <w:rPr/>
-      </w:pPr>
-      <w:r>
-        <w:rPr/>
-      </w:r>
-    </w:p>
-    <w:p>
-      <w:pPr>
-        <w:pStyle w:val="normal1"/>
-        <w:rPr/>
-      </w:pPr>
-      <w:r>
-        <w:rPr/>
-      </w:r>
-    </w:p>
-    <w:p>
-      <w:pPr>
-        <w:pStyle w:val="normal1"/>
-        <w:rPr/>
-      </w:pPr>
-      <w:r>
-        <w:rPr/>
-      </w:r>
-    </w:p>
-    <w:p>
-      <w:pPr>
-        <w:pStyle w:val="normal1"/>
-        <w:rPr/>
-      </w:pPr>
-      <w:r>
-        <w:rPr/>
-      </w:r>
-    </w:p>
-    <w:p>
-      <w:pPr>
-        <w:pStyle w:val="normal1"/>
-        <w:rPr/>
-      </w:pPr>
-      <w:r>
-        <w:rPr/>
-      </w:r>
-    </w:p>
-    <w:p>
-      <w:pPr>
-        <w:pStyle w:val="normal1"/>
-        <w:rPr/>
-      </w:pPr>
-      <w:r>
-        <w:rPr/>
-      </w:r>
-    </w:p>
-    <w:p>
-      <w:pPr>
-        <w:pStyle w:val="normal1"/>
-        <w:rPr/>
-      </w:pPr>
-      <w:r>
-        <w:rPr/>
-      </w:r>
-    </w:p>
-    <w:p>
-      <w:pPr>
-        <w:pStyle w:val="normal1"/>
-        <w:rPr/>
-      </w:pPr>
-      <w:r>
-        <w:rPr/>
-      </w:r>
-    </w:p>
-    <w:p>
-      <w:pPr>
-        <w:pStyle w:val="normal1"/>
-        <w:rPr/>
-      </w:pPr>
-      <w:r>
-        <w:rPr/>
-      </w:r>
-    </w:p>
-    <w:p>
-      <w:pPr>
-        <w:pStyle w:val="normal1"/>
-        <w:rPr/>
-      </w:pPr>
-      <w:r>
-        <w:rPr/>
-      </w:r>
-    </w:p>
-    <w:p>
-      <w:pPr>
-        <w:pStyle w:val="normal1"/>
-        <w:rPr/>
-      </w:pPr>
-      <w:r>
-        <w:rPr/>
-      </w:r>
-    </w:p>
-    <w:p>
-      <w:pPr>
-        <w:pStyle w:val="normal1"/>
-        <w:rPr/>
-      </w:pPr>
-      <w:r>
-        <w:rPr/>
-      </w:r>
-    </w:p>
-    <w:p>
-      <w:pPr>
-        <w:pStyle w:val="normal1"/>
-        <w:rPr/>
-      </w:pPr>
-      <w:r>
-        <w:rPr/>
-      </w:r>
-    </w:p>
-    <w:p>
-      <w:pPr>
-        <w:pStyle w:val="normal1"/>
-        <w:rPr/>
-      </w:pPr>
-      <w:r>
-        <w:rPr/>
-      </w:r>
-    </w:p>
-    <w:p>
-      <w:pPr>
-        <w:pStyle w:val="normal1"/>
-        <w:rPr/>
-      </w:pPr>
-      <w:r>
-        <w:rPr/>
-      </w:r>
-    </w:p>
-    <w:p>
-      <w:pPr>
-        <w:pStyle w:val="normal1"/>
-        <w:rPr/>
-      </w:pPr>
-      <w:r>
-        <w:rPr/>
-      </w:r>
-    </w:p>
-    <w:p>
-      <w:pPr>
-        <w:pStyle w:val="normal1"/>
-        <w:rPr/>
-      </w:pPr>
-      <w:r>
-        <w:rPr/>
-      </w:r>
-    </w:p>
-    <w:p>
-      <w:pPr>
-        <w:pStyle w:val="normal1"/>
-        <w:rPr/>
-      </w:pPr>
-      <w:r>
-        <w:rPr/>
-      </w:r>
-    </w:p>
-    <w:p>
-      <w:pPr>
-        <w:pStyle w:val="normal1"/>
-        <w:rPr/>
-      </w:pPr>
-      <w:r>
-        <w:rPr/>
-      </w:r>
-    </w:p>
-    <w:p>
-      <w:pPr>
-        <w:pStyle w:val="normal1"/>
-        <w:rPr/>
-      </w:pPr>
-      <w:r>
-        <w:rPr/>
-      </w:r>
-    </w:p>
-    <w:p>
-      <w:pPr>
-        <w:pStyle w:val="normal1"/>
-        <w:rPr/>
-      </w:pPr>
-      <w:r>
-        <w:rPr/>
-      </w:r>
-    </w:p>
-    <w:p>
-      <w:pPr>
-        <w:pStyle w:val="normal1"/>
-        <w:rPr/>
-      </w:pPr>
-      <w:r>
-        <w:rPr/>
-      </w:r>
-    </w:p>
-    <w:p>
-      <w:pPr>
-        <w:pStyle w:val="normal1"/>
-        <w:rPr/>
-      </w:pPr>
-      <w:r>
-        <w:rPr/>
-      </w:r>
-    </w:p>
-    <w:p>
-      <w:pPr>
-        <w:pStyle w:val="normal1"/>
-        <w:rPr/>
-      </w:pPr>
-      <w:r>
-        <w:rPr/>
         <w:t>Ejercicio 1</w:t>
       </w:r>
     </w:p>
@@ -1166,384 +733,6 @@
       </w:pPr>
       <w:r>
         <w:rPr/>
-      </w:r>
-    </w:p>
-    <w:p>
-      <w:pPr>
-        <w:pStyle w:val="normal1"/>
-        <w:rPr/>
-      </w:pPr>
-      <w:r>
-        <w:rPr/>
-      </w:r>
-    </w:p>
-    <w:p>
-      <w:pPr>
-        <w:pStyle w:val="normal1"/>
-        <w:rPr/>
-      </w:pPr>
-      <w:r>
-        <w:rPr/>
-      </w:r>
-    </w:p>
-    <w:p>
-      <w:pPr>
-        <w:pStyle w:val="normal1"/>
-        <w:rPr/>
-      </w:pPr>
-      <w:r>
-        <w:rPr/>
-      </w:r>
-    </w:p>
-    <w:p>
-      <w:pPr>
-        <w:pStyle w:val="normal1"/>
-        <w:rPr/>
-      </w:pPr>
-      <w:r>
-        <w:rPr/>
-      </w:r>
-    </w:p>
-    <w:p>
-      <w:pPr>
-        <w:pStyle w:val="normal1"/>
-        <w:rPr/>
-      </w:pPr>
-      <w:r>
-        <w:rPr/>
-      </w:r>
-    </w:p>
-    <w:p>
-      <w:pPr>
-        <w:pStyle w:val="normal1"/>
-        <w:rPr/>
-      </w:pPr>
-      <w:r>
-        <w:rPr/>
-      </w:r>
-    </w:p>
-    <w:p>
-      <w:pPr>
-        <w:pStyle w:val="normal1"/>
-        <w:rPr/>
-      </w:pPr>
-      <w:r>
-        <w:rPr/>
-      </w:r>
-    </w:p>
-    <w:p>
-      <w:pPr>
-        <w:pStyle w:val="normal1"/>
-        <w:rPr/>
-      </w:pPr>
-      <w:r>
-        <w:rPr/>
-      </w:r>
-    </w:p>
-    <w:p>
-      <w:pPr>
-        <w:pStyle w:val="normal1"/>
-        <w:rPr/>
-      </w:pPr>
-      <w:r>
-        <w:rPr/>
-      </w:r>
-    </w:p>
-    <w:p>
-      <w:pPr>
-        <w:pStyle w:val="normal1"/>
-        <w:rPr/>
-      </w:pPr>
-      <w:r>
-        <w:rPr/>
-      </w:r>
-    </w:p>
-    <w:p>
-      <w:pPr>
-        <w:pStyle w:val="normal1"/>
-        <w:rPr/>
-      </w:pPr>
-      <w:r>
-        <w:rPr/>
-      </w:r>
-    </w:p>
-    <w:p>
-      <w:pPr>
-        <w:pStyle w:val="normal1"/>
-        <w:rPr/>
-      </w:pPr>
-      <w:r>
-        <w:rPr/>
-      </w:r>
-    </w:p>
-    <w:p>
-      <w:pPr>
-        <w:pStyle w:val="normal1"/>
-        <w:rPr/>
-      </w:pPr>
-      <w:r>
-        <w:rPr/>
-      </w:r>
-    </w:p>
-    <w:p>
-      <w:pPr>
-        <w:pStyle w:val="normal1"/>
-        <w:rPr/>
-      </w:pPr>
-      <w:r>
-        <w:rPr/>
-      </w:r>
-    </w:p>
-    <w:p>
-      <w:pPr>
-        <w:pStyle w:val="normal1"/>
-        <w:rPr/>
-      </w:pPr>
-      <w:r>
-        <w:rPr/>
-      </w:r>
-    </w:p>
-    <w:p>
-      <w:pPr>
-        <w:pStyle w:val="normal1"/>
-        <w:rPr/>
-      </w:pPr>
-      <w:r>
-        <w:rPr/>
-      </w:r>
-    </w:p>
-    <w:p>
-      <w:pPr>
-        <w:pStyle w:val="normal1"/>
-        <w:rPr/>
-      </w:pPr>
-      <w:r>
-        <w:rPr/>
-      </w:r>
-    </w:p>
-    <w:p>
-      <w:pPr>
-        <w:pStyle w:val="normal1"/>
-        <w:rPr/>
-      </w:pPr>
-      <w:r>
-        <w:rPr/>
-      </w:r>
-    </w:p>
-    <w:p>
-      <w:pPr>
-        <w:pStyle w:val="normal1"/>
-        <w:rPr/>
-      </w:pPr>
-      <w:r>
-        <w:rPr/>
-      </w:r>
-    </w:p>
-    <w:p>
-      <w:pPr>
-        <w:pStyle w:val="normal1"/>
-        <w:rPr/>
-      </w:pPr>
-      <w:r>
-        <w:rPr/>
-      </w:r>
-    </w:p>
-    <w:p>
-      <w:pPr>
-        <w:pStyle w:val="normal1"/>
-        <w:rPr/>
-      </w:pPr>
-      <w:r>
-        <w:rPr/>
-      </w:r>
-    </w:p>
-    <w:p>
-      <w:pPr>
-        <w:pStyle w:val="normal1"/>
-        <w:rPr/>
-      </w:pPr>
-      <w:r>
-        <w:rPr/>
-      </w:r>
-    </w:p>
-    <w:p>
-      <w:pPr>
-        <w:pStyle w:val="normal1"/>
-        <w:rPr/>
-      </w:pPr>
-      <w:r>
-        <w:rPr/>
-      </w:r>
-    </w:p>
-    <w:p>
-      <w:pPr>
-        <w:pStyle w:val="normal1"/>
-        <w:rPr/>
-      </w:pPr>
-      <w:r>
-        <w:rPr/>
-      </w:r>
-    </w:p>
-    <w:p>
-      <w:pPr>
-        <w:pStyle w:val="normal1"/>
-        <w:rPr/>
-      </w:pPr>
-      <w:r>
-        <w:rPr/>
-      </w:r>
-    </w:p>
-    <w:p>
-      <w:pPr>
-        <w:pStyle w:val="normal1"/>
-        <w:rPr/>
-      </w:pPr>
-      <w:r>
-        <w:rPr/>
-      </w:r>
-    </w:p>
-    <w:p>
-      <w:pPr>
-        <w:pStyle w:val="normal1"/>
-        <w:rPr/>
-      </w:pPr>
-      <w:r>
-        <w:rPr/>
-      </w:r>
-    </w:p>
-    <w:p>
-      <w:pPr>
-        <w:pStyle w:val="normal1"/>
-        <w:rPr/>
-      </w:pPr>
-      <w:r>
-        <w:rPr/>
-      </w:r>
-    </w:p>
-    <w:p>
-      <w:pPr>
-        <w:pStyle w:val="normal1"/>
-        <w:rPr/>
-      </w:pPr>
-      <w:r>
-        <w:rPr/>
-      </w:r>
-    </w:p>
-    <w:p>
-      <w:pPr>
-        <w:pStyle w:val="normal1"/>
-        <w:rPr/>
-      </w:pPr>
-      <w:r>
-        <w:rPr/>
-      </w:r>
-    </w:p>
-    <w:p>
-      <w:pPr>
-        <w:pStyle w:val="normal1"/>
-        <w:rPr/>
-      </w:pPr>
-      <w:r>
-        <w:rPr/>
-      </w:r>
-    </w:p>
-    <w:p>
-      <w:pPr>
-        <w:pStyle w:val="normal1"/>
-        <w:rPr/>
-      </w:pPr>
-      <w:r>
-        <w:rPr/>
-      </w:r>
-    </w:p>
-    <w:p>
-      <w:pPr>
-        <w:pStyle w:val="normal1"/>
-        <w:rPr/>
-      </w:pPr>
-      <w:r>
-        <w:rPr/>
-      </w:r>
-    </w:p>
-    <w:p>
-      <w:pPr>
-        <w:pStyle w:val="normal1"/>
-        <w:rPr/>
-      </w:pPr>
-      <w:r>
-        <w:rPr/>
-      </w:r>
-    </w:p>
-    <w:p>
-      <w:pPr>
-        <w:pStyle w:val="normal1"/>
-        <w:rPr/>
-      </w:pPr>
-      <w:r>
-        <w:rPr/>
-      </w:r>
-    </w:p>
-    <w:p>
-      <w:pPr>
-        <w:pStyle w:val="normal1"/>
-        <w:rPr/>
-      </w:pPr>
-      <w:r>
-        <w:rPr/>
-      </w:r>
-    </w:p>
-    <w:p>
-      <w:pPr>
-        <w:pStyle w:val="normal1"/>
-        <w:rPr/>
-      </w:pPr>
-      <w:r>
-        <w:rPr/>
-      </w:r>
-    </w:p>
-    <w:p>
-      <w:pPr>
-        <w:pStyle w:val="normal1"/>
-        <w:rPr/>
-      </w:pPr>
-      <w:r>
-        <w:rPr/>
-      </w:r>
-    </w:p>
-    <w:p>
-      <w:pPr>
-        <w:pStyle w:val="normal1"/>
-        <w:rPr/>
-      </w:pPr>
-      <w:r>
-        <w:rPr/>
-      </w:r>
-    </w:p>
-    <w:p>
-      <w:pPr>
-        <w:pStyle w:val="normal1"/>
-        <w:rPr/>
-      </w:pPr>
-      <w:r>
-        <w:rPr/>
-      </w:r>
-    </w:p>
-    <w:p>
-      <w:pPr>
-        <w:pStyle w:val="normal1"/>
-        <w:rPr/>
-      </w:pPr>
-      <w:r>
-        <w:rPr/>
-      </w:r>
-    </w:p>
-    <w:p>
-      <w:pPr>
-        <w:pStyle w:val="normal1"/>
-        <w:rPr/>
-      </w:pPr>
-      <w:r>
-        <w:rPr/>
         <w:t>Ejercicio 2</w:t>
       </w:r>
     </w:p>
@@ -1654,6 +843,38 @@
       </w:pPr>
       <w:r>
         <w:rPr/>
+      </w:r>
+    </w:p>
+    <w:p>
+      <w:pPr>
+        <w:pStyle w:val="normal1"/>
+        <w:rPr/>
+      </w:pPr>
+      <w:r>
+        <w:rPr/>
+        <w:t xml:space="preserve">En esta búsqueda da este resultado debido que ha estado cayendo por el lado izquierdo, chocando con nodos repetidos y tomando la siguiente ruta es decir el lado derecho </w:t>
+      </w:r>
+      <w:r>
+        <w:rPr/>
+        <w:t>repetidamente hasta toparse con la meta.</w:t>
+      </w:r>
+    </w:p>
+    <w:p>
+      <w:pPr>
+        <w:pStyle w:val="normal1"/>
+        <w:rPr/>
+      </w:pPr>
+      <w:r>
+        <w:rPr/>
+      </w:r>
+    </w:p>
+    <w:p>
+      <w:pPr>
+        <w:pStyle w:val="normal1"/>
+        <w:rPr/>
+      </w:pPr>
+      <w:r>
+        <w:rPr/>
         <w:t>BFS</w:t>
       </w:r>
     </w:p>
@@ -1726,6 +947,29 @@
       </w:pPr>
       <w:r>
         <w:rPr/>
+        <w:t xml:space="preserve">En esta búsqueda da este resultado debido </w:t>
+      </w:r>
+      <w:r>
+        <w:rPr/>
+        <w:t>a que ha recorrido todos los nodos posibles y ha encontrado el mejor camino a la meta.</w:t>
+      </w:r>
+    </w:p>
+    <w:p>
+      <w:pPr>
+        <w:pStyle w:val="normal1"/>
+        <w:rPr/>
+      </w:pPr>
+      <w:r>
+        <w:rPr/>
+      </w:r>
+    </w:p>
+    <w:p>
+      <w:pPr>
+        <w:pStyle w:val="normal1"/>
+        <w:rPr/>
+      </w:pPr>
+      <w:r>
+        <w:rPr/>
         <w:t>Lower Cost First</w:t>
       </w:r>
     </w:p>
@@ -1817,26 +1061,294 @@
       </w:pPr>
       <w:r>
         <w:rPr/>
-        <w:t>Heuristica 1</w:t>
-      </w:r>
-    </w:p>
-    <w:p>
-      <w:pPr>
-        <w:pStyle w:val="normal1"/>
-        <w:rPr/>
-      </w:pPr>
-      <w:r>
-        <w:rPr/>
-      </w:r>
-    </w:p>
-    <w:p>
-      <w:pPr>
-        <w:pStyle w:val="normal1"/>
-        <w:rPr/>
-      </w:pPr>
-      <w:r>
-        <w:rPr/>
-        <w:t>Heuristica 2: Manhattan</w:t>
+        <w:t>Heurística</w:t>
+      </w:r>
+      <w:r>
+        <w:rPr/>
+        <w:t xml:space="preserve"> 1: </w:t>
+      </w:r>
+      <w:r>
+        <w:rPr/>
+        <w:t>Coste de las vueltas según la posición de la tortita mas grande</w:t>
+      </w:r>
+    </w:p>
+    <w:p>
+      <w:pPr>
+        <w:pStyle w:val="normal1"/>
+        <w:rPr/>
+      </w:pPr>
+      <w:r>
+        <w:rPr/>
+      </w:r>
+    </w:p>
+    <w:p>
+      <w:pPr>
+        <w:pStyle w:val="normal1"/>
+        <w:rPr/>
+      </w:pPr>
+      <w:r>
+        <w:rPr/>
+        <w:t>Este eucarística se basa en la posición de la tortita mas grande, es decir si esta se encuentra en su posición vale 0, si se encuentra la primera vale 1 y si esta en el medio vale 2. Estos números son el numero de vueltas que habría que hacer para que estuviera en su sitio. Esta eucarística es admisible ya que el numero máximo de vueltas es 2 que es inferior o igual al coste real siendo este de 4.</w:t>
+      </w:r>
+    </w:p>
+    <w:p>
+      <w:pPr>
+        <w:pStyle w:val="normal1"/>
+        <w:rPr/>
+      </w:pPr>
+      <w:r>
+        <w:rPr/>
+      </w:r>
+    </w:p>
+    <w:p>
+      <w:pPr>
+        <w:pStyle w:val="normal1"/>
+        <w:rPr/>
+      </w:pPr>
+      <w:r>
+        <w:rPr/>
+        <w:t>A*</w:t>
+      </w:r>
+    </w:p>
+    <w:p>
+      <w:pPr>
+        <w:pStyle w:val="normal1"/>
+        <w:rPr/>
+      </w:pPr>
+      <w:r>
+        <w:rPr/>
+      </w:r>
+    </w:p>
+    <w:p>
+      <w:pPr>
+        <w:pStyle w:val="normal1"/>
+        <w:bidi w:val="0"/>
+        <w:rPr/>
+      </w:pPr>
+      <w:r>
+        <w:rPr/>
+        <w:t xml:space="preserve">CURRENT PATH: </w:t>
+      </w:r>
+    </w:p>
+    <w:p>
+      <w:pPr>
+        <w:pStyle w:val="normal1"/>
+        <w:bidi w:val="0"/>
+        <w:rPr/>
+      </w:pPr>
+      <w:r>
+        <w:rPr/>
+        <w:t xml:space="preserve">   </w:t>
+      </w:r>
+      <w:r>
+        <w:rPr/>
+        <w:t>[2,4,1,3] --&gt; [4,2,1,3] --&gt; [3,1,2,4] --&gt; [2,1,3,4] --&gt; [1,2,3,4] (Goal)</w:t>
+      </w:r>
+    </w:p>
+    <w:p>
+      <w:pPr>
+        <w:pStyle w:val="normal1"/>
+        <w:bidi w:val="0"/>
+        <w:rPr/>
+      </w:pPr>
+      <w:r>
+        <w:rPr/>
+        <w:t>Path to last Goal Node: [2,4,1,3] --&gt; [4,2,1,3] --&gt; [3,1,2,4] --&gt; [2,1,3,4] --&gt; [1,2,3,4] (Goal) Cost: 4.0</w:t>
+      </w:r>
+    </w:p>
+    <w:p>
+      <w:pPr>
+        <w:pStyle w:val="normal1"/>
+        <w:bidi w:val="0"/>
+        <w:rPr/>
+      </w:pPr>
+      <w:r>
+        <w:rPr/>
+        <w:t>Nodes expanded: 20</w:t>
+      </w:r>
+    </w:p>
+    <w:p>
+      <w:pPr>
+        <w:pStyle w:val="normal1"/>
+        <w:bidi w:val="0"/>
+        <w:rPr/>
+      </w:pPr>
+      <w:r>
+        <w:rPr/>
+      </w:r>
+    </w:p>
+    <w:p>
+      <w:pPr>
+        <w:pStyle w:val="normal1"/>
+        <w:rPr/>
+      </w:pPr>
+      <w:r>
+        <w:rPr/>
+        <w:t xml:space="preserve">En esta búsqueda da este resultado debido </w:t>
+      </w:r>
+      <w:r>
+        <w:rPr/>
+        <w:t>a que ha sumado el los pasos mas la heuristica dada de cada nodo, según el numero de vueltas de la ultima tortita. Este da un resultado mejor que las otras y mas bajo dado un resultado optimo (2-&gt;1-&gt;0-&gt;0-&gt;0).</w:t>
+      </w:r>
+    </w:p>
+    <w:p>
+      <w:pPr>
+        <w:pStyle w:val="normal1"/>
+        <w:bidi w:val="0"/>
+        <w:rPr/>
+      </w:pPr>
+      <w:r>
+        <w:rPr/>
+      </w:r>
+    </w:p>
+    <w:p>
+      <w:pPr>
+        <w:pStyle w:val="normal1"/>
+        <w:bidi w:val="0"/>
+        <w:rPr/>
+      </w:pPr>
+      <w:r>
+        <w:rPr/>
+      </w:r>
+    </w:p>
+    <w:p>
+      <w:pPr>
+        <w:pStyle w:val="normal1"/>
+        <w:rPr/>
+      </w:pPr>
+      <w:r>
+        <w:rPr/>
+        <w:t>Heurística</w:t>
+      </w:r>
+      <w:r>
+        <w:rPr/>
+        <w:t xml:space="preserve"> 2: </w:t>
+      </w:r>
+      <w:r>
+        <w:rPr/>
+        <w:t>Coste según la d</w:t>
+      </w:r>
+      <w:r>
+        <w:rPr/>
+        <w:t>istancia por cercanía</w:t>
+      </w:r>
+    </w:p>
+    <w:p>
+      <w:pPr>
+        <w:pStyle w:val="normal1"/>
+        <w:rPr/>
+      </w:pPr>
+      <w:r>
+        <w:rPr/>
+      </w:r>
+    </w:p>
+    <w:p>
+      <w:pPr>
+        <w:pStyle w:val="normal1"/>
+        <w:rPr/>
+      </w:pPr>
+      <w:r>
+        <w:rPr/>
+        <w:t>Este eucarística se basa en la posición de la tortita según la cercanía al numero, es decir si tienes este bloque [2,4,1,3] como máximo puede dar 4 ya que no hay ninguno numero que este cerca del que debería estar,ni el ultimo numero esta tocando la superficie donde estén puestas las tortitas. Por lo que esta eucarística es admisible ya que el numero máximo de vueltas es 4 que es inferior o igual al coste real siendo este de 4.</w:t>
+      </w:r>
+    </w:p>
+    <w:p>
+      <w:pPr>
+        <w:pStyle w:val="normal1"/>
+        <w:rPr/>
+      </w:pPr>
+      <w:r>
+        <w:rPr/>
+      </w:r>
+    </w:p>
+    <w:p>
+      <w:pPr>
+        <w:pStyle w:val="normal1"/>
+        <w:rPr/>
+      </w:pPr>
+      <w:r>
+        <w:rPr/>
+        <w:t>A*</w:t>
+      </w:r>
+    </w:p>
+    <w:p>
+      <w:pPr>
+        <w:pStyle w:val="normal1"/>
+        <w:rPr/>
+      </w:pPr>
+      <w:r>
+        <w:rPr/>
+      </w:r>
+    </w:p>
+    <w:p>
+      <w:pPr>
+        <w:pStyle w:val="normal1"/>
+        <w:bidi w:val="0"/>
+        <w:rPr/>
+      </w:pPr>
+      <w:r>
+        <w:rPr/>
+        <w:t xml:space="preserve">CURRENT PATH: </w:t>
+      </w:r>
+    </w:p>
+    <w:p>
+      <w:pPr>
+        <w:pStyle w:val="normal1"/>
+        <w:bidi w:val="0"/>
+        <w:rPr/>
+      </w:pPr>
+      <w:r>
+        <w:rPr/>
+        <w:t xml:space="preserve">   </w:t>
+      </w:r>
+      <w:r>
+        <w:rPr/>
+        <w:t>[2,4,1,3] --&gt; [1,4,2,3] --&gt; [4,1,2,3] --&gt; [3,2,1,4] --&gt; [1,2,3,4] (Goal)</w:t>
+      </w:r>
+    </w:p>
+    <w:p>
+      <w:pPr>
+        <w:pStyle w:val="normal1"/>
+        <w:bidi w:val="0"/>
+        <w:rPr/>
+      </w:pPr>
+      <w:r>
+        <w:rPr/>
+        <w:t>Path to last Goal Node: [2,4,1,3] --&gt; [1,4,2,3] --&gt; [4,1,2,3] --&gt; [3,2,1,4] --&gt; [1,2,3,4] (Goal) Cost: 4.0</w:t>
+      </w:r>
+    </w:p>
+    <w:p>
+      <w:pPr>
+        <w:pStyle w:val="normal1"/>
+        <w:bidi w:val="0"/>
+        <w:rPr/>
+      </w:pPr>
+      <w:r>
+        <w:rPr/>
+        <w:t>Nodes expanded: 9</w:t>
+      </w:r>
+    </w:p>
+    <w:p>
+      <w:pPr>
+        <w:pStyle w:val="normal1"/>
+        <w:rPr/>
+      </w:pPr>
+      <w:r>
+        <w:rPr/>
+      </w:r>
+    </w:p>
+    <w:p>
+      <w:pPr>
+        <w:pStyle w:val="normal1"/>
+        <w:rPr/>
+      </w:pPr>
+      <w:r>
+        <w:rPr/>
+        <w:t xml:space="preserve">En esta búsqueda da este resultado debido </w:t>
+      </w:r>
+      <w:r>
+        <w:rPr/>
+        <w:t>a que ha sumado el los pasos mas la heuristica dada de cada nodo, según la cercanía de cada de cada tortita (1 cerca de 2, 2 cerca de 1 y 3 y así con el 3 y el 4). Este da un resultado mejor que las otras y mas bajo dado un resultado optimo (4-&gt;3-&gt;2-&gt;1-&gt;0).</w:t>
       </w:r>
     </w:p>
     <w:sectPr>
@@ -1918,6 +1430,7 @@
     <w:name w:val="Normal"/>
     <w:pPr>
       <w:widowControl/>
+      <w:suppressAutoHyphens w:val="true"/>
       <w:bidi w:val="0"/>
       <w:spacing w:lineRule="auto" w:line="276" w:before="0" w:after="0"/>
       <w:jc w:val="start"/>
@@ -2086,10 +1599,35 @@
       <w:rFonts w:cs="Tahoma"/>
     </w:rPr>
   </w:style>
+  <w:style w:type="paragraph" w:styleId="Ttulouser">
+    <w:name w:val="Título (user)"/>
+    <w:basedOn w:val="Normal"/>
+    <w:next w:val="BodyText"/>
+    <w:pPr>
+      <w:keepNext w:val="true"/>
+      <w:spacing w:before="240" w:after="120"/>
+    </w:pPr>
+    <w:rPr>
+      <w:rFonts w:ascii="Liberation Sans" w:hAnsi="Liberation Sans" w:eastAsia="MS Gothic" w:cs="Tahoma"/>
+      <w:sz w:val="28"/>
+      <w:szCs w:val="28"/>
+    </w:rPr>
+  </w:style>
+  <w:style w:type="paragraph" w:styleId="ndiceuser">
+    <w:name w:val="Índice (user)"/>
+    <w:basedOn w:val="Normal"/>
+    <w:pPr>
+      <w:suppressLineNumbers/>
+    </w:pPr>
+    <w:rPr>
+      <w:rFonts w:cs="Tahoma"/>
+    </w:rPr>
+  </w:style>
   <w:style w:type="paragraph" w:styleId="normal1" w:default="1">
     <w:name w:val="normal1"/>
     <w:pPr>
       <w:widowControl/>
+      <w:suppressAutoHyphens w:val="true"/>
       <w:bidi w:val="0"/>
       <w:spacing w:lineRule="auto" w:line="276" w:before="0" w:after="0"/>
       <w:jc w:val="start"/>
@@ -2137,6 +1675,12 @@
       <w:szCs w:val="30"/>
     </w:rPr>
   </w:style>
+  <w:style w:type="paragraph" w:styleId="Cabeceraypieuser">
+    <w:name w:val="Cabecera y pie (user)"/>
+    <w:basedOn w:val="Normal"/>
+    <w:pPr/>
+    <w:rPr/>
+  </w:style>
   <w:style w:type="paragraph" w:styleId="Cabeceraypie">
     <w:name w:val="Cabecera y pie"/>
     <w:basedOn w:val="Normal"/>
@@ -2145,7 +1689,7 @@
   </w:style>
   <w:style w:type="paragraph" w:styleId="Header">
     <w:name w:val="header"/>
-    <w:basedOn w:val="Cabeceraypie"/>
+    <w:basedOn w:val="Cabeceraypieuser"/>
     <w:pPr/>
     <w:rPr/>
   </w:style>

</xml_diff>